<commit_message>
Huge work on the report.
</commit_message>
<xml_diff>
--- a/assessment/part_1/5-Report-Semantic-Network.docx
+++ b/assessment/part_1/5-Report-Semantic-Network.docx
@@ -558,8 +558,8 @@
             </w:pPr>
             <w:bookmarkStart w:id="7" w:name="__RefHeading___Toc3123_3504685749"/>
             <w:bookmarkStart w:id="8" w:name="_Toc215733929"/>
-            <w:bookmarkStart w:id="9" w:name="_Toc155876011"/>
-            <w:bookmarkStart w:id="10" w:name="_Toc199754779"/>
+            <w:bookmarkStart w:id="9" w:name="_Toc199754779"/>
+            <w:bookmarkStart w:id="10" w:name="_Toc155876011"/>
             <w:bookmarkEnd w:id="7"/>
             <w:r>
               <w:rPr>
@@ -1259,11 +1259,208 @@
       <w:r>
         <w:rPr/>
       </w:r>
+      <w:r>
+        <w:br w:type="page"/>
+      </w:r>
+    </w:p>
+    <w:p>
+      <w:pPr>
+        <w:pStyle w:val="Heading1"/>
+        <w:numPr>
+          <w:ilvl w:val="0"/>
+          <w:numId w:val="1"/>
+        </w:numPr>
+        <w:ind w:hanging="0" w:start="0"/>
+        <w:rPr/>
+      </w:pPr>
+      <w:r>
+        <w:rPr/>
+        <w:t>Part 2: Connectionist Methods</w:t>
+      </w:r>
+    </w:p>
+    <w:p>
+      <w:pPr>
+        <w:pStyle w:val="Normal"/>
+        <w:numPr>
+          <w:ilvl w:val="0"/>
+          <w:numId w:val="1"/>
+        </w:numPr>
+        <w:rPr/>
+      </w:pPr>
+      <w:bookmarkStart w:id="16" w:name="__RefHeading___Toc3125_3504685749_Copy_1"/>
+      <w:bookmarkEnd w:id="16"/>
+      <w:r>
+        <w:rPr/>
+        <w:t xml:space="preserve">What we are doing, why we are doing it, and how we are doing it… </w:t>
+      </w:r>
+    </w:p>
+    <w:p>
+      <w:pPr>
+        <w:pStyle w:val="Normal"/>
+        <w:rPr/>
+      </w:pPr>
+      <w:r>
+        <w:rPr/>
+      </w:r>
+    </w:p>
+    <w:p>
+      <w:pPr>
+        <w:pStyle w:val="Normal"/>
+        <w:rPr/>
+      </w:pPr>
+      <w:r>
+        <w:rPr/>
+        <w:t>Dataset Preparation</w:t>
+      </w:r>
+    </w:p>
+    <w:p>
+      <w:pPr>
+        <w:pStyle w:val="Normal"/>
+        <w:rPr/>
+      </w:pPr>
+      <w:r>
+        <w:rPr/>
+      </w:r>
+    </w:p>
+    <w:p>
+      <w:pPr>
+        <w:pStyle w:val="Normal"/>
+        <w:rPr/>
+      </w:pPr>
+      <w:r>
+        <w:rPr/>
+      </w:r>
+    </w:p>
+    <w:p>
+      <w:pPr>
+        <w:pStyle w:val="Normal"/>
+        <w:rPr/>
+      </w:pPr>
+      <w:r>
+        <w:rPr/>
+        <w:t>ANN From Scratch</w:t>
+      </w:r>
+    </w:p>
+    <w:p>
+      <w:pPr>
+        <w:pStyle w:val="Normal"/>
+        <w:rPr/>
+      </w:pPr>
+      <w:r>
+        <w:rPr/>
+      </w:r>
+    </w:p>
+    <w:p>
+      <w:pPr>
+        <w:pStyle w:val="Normal"/>
+        <w:rPr/>
+      </w:pPr>
+      <w:r>
+        <w:rPr/>
+      </w:r>
+    </w:p>
+    <w:p>
+      <w:pPr>
+        <w:pStyle w:val="Normal"/>
+        <w:rPr/>
+      </w:pPr>
+      <w:r>
+        <w:rPr/>
+        <w:t xml:space="preserve">Performance Evaluation </w:t>
+      </w:r>
+    </w:p>
+    <w:p>
+      <w:pPr>
+        <w:pStyle w:val="Normal"/>
+        <w:rPr/>
+      </w:pPr>
+      <w:r>
+        <w:rPr/>
+      </w:r>
+    </w:p>
+    <w:p>
+      <w:pPr>
+        <w:pStyle w:val="Normal"/>
+        <w:rPr/>
+      </w:pPr>
+      <w:r>
+        <w:rPr/>
+      </w:r>
+    </w:p>
+    <w:p>
+      <w:pPr>
+        <w:pStyle w:val="Normal"/>
+        <w:rPr/>
+      </w:pPr>
+      <w:r>
+        <w:rPr/>
+        <w:t>ANN Implementation with Libraries</w:t>
+      </w:r>
+    </w:p>
+    <w:p>
+      <w:pPr>
+        <w:pStyle w:val="Normal"/>
+        <w:rPr/>
+      </w:pPr>
+      <w:r>
+        <w:rPr/>
+      </w:r>
+    </w:p>
+    <w:p>
+      <w:pPr>
+        <w:pStyle w:val="Normal"/>
+        <w:rPr/>
+      </w:pPr>
+      <w:r>
+        <w:rPr/>
+      </w:r>
+    </w:p>
+    <w:p>
+      <w:pPr>
+        <w:pStyle w:val="Normal"/>
+        <w:rPr/>
+      </w:pPr>
+      <w:r>
+        <w:rPr/>
+        <w:t>Parameter Tuning and Model Optimisation</w:t>
+      </w:r>
+    </w:p>
+    <w:p>
+      <w:pPr>
+        <w:pStyle w:val="Normal"/>
+        <w:rPr/>
+      </w:pPr>
+      <w:r>
+        <w:rPr/>
+      </w:r>
+    </w:p>
+    <w:p>
+      <w:pPr>
+        <w:pStyle w:val="Normal"/>
+        <w:rPr/>
+      </w:pPr>
+      <w:r>
+        <w:rPr/>
+      </w:r>
+    </w:p>
+    <w:p>
+      <w:pPr>
+        <w:pStyle w:val="Normal"/>
+        <w:numPr>
+          <w:ilvl w:val="0"/>
+          <w:numId w:val="1"/>
+        </w:numPr>
+        <w:rPr/>
+      </w:pPr>
+      <w:r>
+        <w:rPr/>
+      </w:r>
     </w:p>
     <w:sectPr>
+      <w:footerReference w:type="default" r:id="rId2"/>
       <w:type w:val="nextPage"/>
       <w:pgSz w:w="11906" w:h="16838"/>
-      <w:pgMar w:left="1134" w:right="1134" w:gutter="0" w:header="0" w:top="1134" w:footer="0" w:bottom="1134"/>
+      <w:pgMar w:left="1134" w:right="1134" w:gutter="0" w:header="0" w:top="1134" w:footer="1134" w:bottom="1693"/>
       <w:pgNumType w:fmt="decimal"/>
       <w:formProt w:val="false"/>
       <w:textDirection w:val="lrTb"/>
@@ -1271,6 +1468,66 @@
     </w:sectPr>
   </w:body>
 </w:document>
+</file>
+
+<file path=word/footer1.xml><?xml version="1.0" encoding="utf-8"?>
+<w:ftr xmlns:o="urn:schemas-microsoft-com:office:office" xmlns:r="http://schemas.openxmlformats.org/officeDocument/2006/relationships" xmlns:v="urn:schemas-microsoft-com:vml" xmlns:w="http://schemas.openxmlformats.org/wordprocessingml/2006/main" xmlns:w10="urn:schemas-microsoft-com:office:word" xmlns:wp="http://schemas.openxmlformats.org/drawingml/2006/wordprocessingDrawing" xmlns:wps="http://schemas.microsoft.com/office/word/2010/wordprocessingShape" xmlns:wpg="http://schemas.microsoft.com/office/word/2010/wordprocessingGroup" xmlns:mc="http://schemas.openxmlformats.org/markup-compatibility/2006" xmlns:wp14="http://schemas.microsoft.com/office/word/2010/wordprocessingDrawing" xmlns:w14="http://schemas.microsoft.com/office/word/2010/wordml" xmlns:w15="http://schemas.microsoft.com/office/word/2012/wordml" mc:Ignorable="w14 wp14 w15">
+  <w:p>
+    <w:pPr>
+      <w:pStyle w:val="Footer"/>
+      <w:jc w:val="center"/>
+      <w:rPr/>
+    </w:pPr>
+    <w:r>
+      <w:rPr/>
+      <w:t xml:space="preserve">Page </w:t>
+    </w:r>
+    <w:r>
+      <w:rPr/>
+      <w:fldChar w:fldCharType="begin"/>
+    </w:r>
+    <w:r>
+      <w:rPr/>
+      <w:instrText xml:space="preserve"> PAGE </w:instrText>
+    </w:r>
+    <w:r>
+      <w:rPr/>
+      <w:fldChar w:fldCharType="separate"/>
+    </w:r>
+    <w:r>
+      <w:rPr/>
+      <w:t>5</w:t>
+    </w:r>
+    <w:r>
+      <w:rPr/>
+      <w:fldChar w:fldCharType="end"/>
+    </w:r>
+    <w:r>
+      <w:rPr/>
+      <w:t xml:space="preserve"> of </w:t>
+    </w:r>
+    <w:r>
+      <w:rPr/>
+      <w:fldChar w:fldCharType="begin"/>
+    </w:r>
+    <w:r>
+      <w:rPr/>
+      <w:instrText xml:space="preserve"> NUMPAGES </w:instrText>
+    </w:r>
+    <w:r>
+      <w:rPr/>
+      <w:fldChar w:fldCharType="separate"/>
+    </w:r>
+    <w:r>
+      <w:rPr/>
+      <w:t>5</w:t>
+    </w:r>
+    <w:r>
+      <w:rPr/>
+      <w:fldChar w:fldCharType="end"/>
+    </w:r>
+  </w:p>
+</w:ftr>
 </file>
 
 <file path=word/numbering.xml><?xml version="1.0" encoding="utf-8"?>
@@ -2151,6 +2408,28 @@
     </w:pPr>
     <w:rPr/>
   </w:style>
+  <w:style w:type="paragraph" w:styleId="HeaderandFooter">
+    <w:name w:val="Header and Footer"/>
+    <w:basedOn w:val="Normal"/>
+    <w:qFormat/>
+    <w:pPr>
+      <w:suppressLineNumbers/>
+      <w:tabs>
+        <w:tab w:val="clear" w:pos="709"/>
+        <w:tab w:val="center" w:pos="4819" w:leader="none"/>
+        <w:tab w:val="right" w:pos="9638" w:leader="none"/>
+      </w:tabs>
+    </w:pPr>
+    <w:rPr/>
+  </w:style>
+  <w:style w:type="paragraph" w:styleId="Footer">
+    <w:name w:val="Footer"/>
+    <w:basedOn w:val="HeaderandFooter"/>
+    <w:pPr>
+      <w:suppressLineNumbers/>
+    </w:pPr>
+    <w:rPr/>
+  </w:style>
   <w:style w:type="numbering" w:styleId="NoList" w:default="1">
     <w:name w:val="No List"/>
     <w:uiPriority w:val="99"/>

</xml_diff>